<commit_message>
chore: resolve merge conflicts and update docs
</commit_message>
<xml_diff>
--- a/Quill Report.docx
+++ b/Quill Report.docx
@@ -1418,12 +1418,12 @@
                 <wp:inline distB="114300" distT="114300" distL="114300" distR="114300">
                   <wp:extent cx="2257425" cy="1701800"/>
                   <wp:effectExtent b="0" l="0" r="0" t="0"/>
-                  <wp:docPr id="6" name="image7.png"/>
+                  <wp:docPr id="6" name="image4.png"/>
                   <a:graphic>
                     <a:graphicData uri="http://schemas.openxmlformats.org/drawingml/2006/picture">
                       <pic:pic>
                         <pic:nvPicPr>
-                          <pic:cNvPr id="0" name="image7.png"/>
+                          <pic:cNvPr id="0" name="image4.png"/>
                           <pic:cNvPicPr preferRelativeResize="0"/>
                         </pic:nvPicPr>
                         <pic:blipFill>
@@ -1563,12 +1563,12 @@
                 <wp:inline distB="114300" distT="114300" distL="114300" distR="114300">
                   <wp:extent cx="2257425" cy="4889500"/>
                   <wp:effectExtent b="0" l="0" r="0" t="0"/>
-                  <wp:docPr id="5" name="image6.png"/>
+                  <wp:docPr id="5" name="image7.png"/>
                   <a:graphic>
                     <a:graphicData uri="http://schemas.openxmlformats.org/drawingml/2006/picture">
                       <pic:pic>
                         <pic:nvPicPr>
-                          <pic:cNvPr id="0" name="image6.png"/>
+                          <pic:cNvPr id="0" name="image7.png"/>
                           <pic:cNvPicPr preferRelativeResize="0"/>
                         </pic:nvPicPr>
                         <pic:blipFill>
@@ -3188,12 +3188,12 @@
           <wp:inline distB="114300" distT="114300" distL="114300" distR="114300">
             <wp:extent cx="4180050" cy="7703649"/>
             <wp:effectExtent b="0" l="0" r="0" t="0"/>
-            <wp:docPr id="1" name="image5.png"/>
+            <wp:docPr id="1" name="image6.png"/>
             <a:graphic>
               <a:graphicData uri="http://schemas.openxmlformats.org/drawingml/2006/picture">
                 <pic:pic>
                   <pic:nvPicPr>
-                    <pic:cNvPr id="0" name="image5.png"/>
+                    <pic:cNvPr id="0" name="image6.png"/>
                     <pic:cNvPicPr preferRelativeResize="0"/>
                   </pic:nvPicPr>
                   <pic:blipFill>
@@ -15848,7 +15848,7 @@
           <w:szCs w:val="20"/>
           <w:rtl w:val="0"/>
         </w:rPr>
-        <w:t xml:space="preserve">Keeping :study as a plain Java library with no Android dependencies worked better than expected. The SM-2 scheduling and quiz-generation code is therefore the same on the phone and watch, and it can be unit-tested on the JVM without an emulator. There is some duplication around the module boundary because each platform still handles its own persistence and UI, but that duplication is relatively small compared with the benefit of keeping the shared logic independent of Android.</w:t>
+        <w:t xml:space="preserve">Keeping :shared as a plain Java library with no Android dependencies worked better than expected. The SM-2 scheduling and quiz-generation code is therefore the same on the phone and watch, and it can be unit-tested on the JVM without an emulator. There is some duplication around the module boundary because each platform still handles its own persistence and UI, but that duplication is relatively small compared with the benefit of keeping the shared logic independent of Android.</w:t>
       </w:r>
     </w:p>
     <w:p>
@@ -17205,12 +17205,12 @@
               <wp:inline distB="114300" distT="114300" distL="114300" distR="114300">
                 <wp:extent cx="1647825" cy="673100"/>
                 <wp:effectExtent b="0" l="0" r="0" t="0"/>
-                <wp:docPr id="3" name="image4.png"/>
+                <wp:docPr id="3" name="image5.png"/>
                 <a:graphic>
                   <a:graphicData uri="http://schemas.openxmlformats.org/drawingml/2006/picture">
                     <pic:pic>
                       <pic:nvPicPr>
-                        <pic:cNvPr id="0" name="image4.png"/>
+                        <pic:cNvPr id="0" name="image5.png"/>
                         <pic:cNvPicPr preferRelativeResize="0"/>
                       </pic:nvPicPr>
                       <pic:blipFill>

</xml_diff>